<commit_message>
Update README and update docx
</commit_message>
<xml_diff>
--- a/doc/PozadavkyPGRF1_Task1_2026.docx
+++ b/doc/PozadavkyPGRF1_Task1_2026.docx
@@ -2505,7 +2505,7 @@
                 <w:lang w:eastAsia="cs-CZ"/>
               </w:rPr>
             </w:pPr>
-            <w:hyperlink r:id="Rf448d689b2c94ded">
+            <w:hyperlink r:id="R42ae4041624c478b">
               <w:r>
                 <w:rPr>
                   <w:rStyle w:val="Hyperlink"/>
@@ -3293,6 +3293,15 @@
                 <w:lang w:eastAsia="cs-CZ"/>
               </w:rPr>
               <w:t xml:space="preserve"> a implementaci správného ovládání</w:t>
+            </w:r>
+            <w:r>
+              <w:rPr>
+                <w:rFonts w:ascii="Arial" w:hAnsi="Arial" w:eastAsia="Arial" w:cs="Arial"/>
+                <w:sz w:val="20"/>
+                <w:szCs w:val="20"/>
+                <w:lang w:eastAsia="cs-CZ"/>
+              </w:rPr>
+              <w:t>, README a komentářS</w:t>
             </w:r>
           </w:p>
         </w:tc>
@@ -4125,7 +4134,7 @@
     <w:name w:val="Hyperlink"/>
     <w:basedOn w:val="DefaultParagraphFont"/>
     <w:unhideWhenUsed/>
-    <w:rsid w:val="469FC200"/>
+    <w:rsid w:val="25058A9B"/>
     <w:rPr>
       <w:color w:val="0563C1"/>
       <w:u w:val="single"/>

</xml_diff>